<commit_message>
420轮 前后端目录分离重构: frontend/(index.html+static+ico) + backend/(运行时py+data+knowledge_base+db+入口+部署文件) + backend/scripts/(探针与一次性工具)
- app.py: 新增 _BASE_DIR/_ROOT_DIR/FRONTEND_DIR/DOCS_DIR 常量; Flask static_folder 指 ../frontend/static; index.html/favicon/docs 路径改锚定
- run.py: 启动前 chdir backend/ (兜住 db/uploads/generated/tmp_export 等 CWD 相对路径); wsgi.py 原有 chdir 语义不变
- Dockerfile/Procfile: 构建上下文改仓库根, gunicorn --chdir backend
- 实测通过: 15知识库加载/SQLite初始化/首页/静态/favicon/api/quota/stats/generated图表全200, 无cookie history 401
</commit_message>
<xml_diff>
--- a/作品说明书_提交版.docx
+++ b/作品说明书_提交版.docx
@@ -1142,6 +1142,38 @@
     </w:p>
     <w:p>
       <w:pPr>
+        <w:pStyle w:val="ListBullet"/>
+      </w:pPr>
+      <w:r>
+        <w:t>对照维度（有实测数据则填，无则写「待补」，严禁编造）：</w:t>
+      </w:r>
+    </w:p>
+    <w:p>
+      <w:pPr>
+        <w:pStyle w:val="ListBullet"/>
+      </w:pPr>
+      <w:r>
+        <w:t>使用系统前后模拟评审得分差值：待补</w:t>
+      </w:r>
+    </w:p>
+    <w:p>
+      <w:pPr>
+        <w:pStyle w:val="ListBullet"/>
+      </w:pPr>
+      <w:r>
+        <w:t>单份申报书平均产出耗时（中位数与区间）：待补</w:t>
+      </w:r>
+    </w:p>
+    <w:p>
+      <w:pPr>
+        <w:pStyle w:val="ListBullet"/>
+      </w:pPr>
+      <w:r>
+        <w:t>导出质量闸门通过率：待补</w:t>
+      </w:r>
+    </w:p>
+    <w:p>
+      <w:pPr>
         <w:pStyle w:val="Heading1"/>
       </w:pPr>
       <w:r>
@@ -1248,6 +1280,38 @@
     </w:p>
     <w:p>
       <w:pPr>
+        <w:pStyle w:val="ListBullet"/>
+      </w:pPr>
+      <w:r>
+        <w:t>市场测算（测算值，取得真实调研数据后必须替换）：基于「全国高等教育在学总规模约 4763 万人」（教育部口径，年份需核实），假设参赛率 8%–12%、四类目标赛事占比 25%，得 TAM 约 95–143 万人；按目标院校渗透率 30% 假设，SAM 约 28–43 万人；按首年渗透率 0.3%–0.5% 假设，SOM 约 850–2150 人。</w:t>
+      </w:r>
+    </w:p>
+    <w:p>
+      <w:pPr>
+        <w:pStyle w:val="ListBullet"/>
+      </w:pPr>
+      <w:r>
+        <w:t>定价区间（测算值）：C 端单次生成 29–59 元；B 端院校授权 3–8 万元/年。</w:t>
+      </w:r>
+    </w:p>
+    <w:p>
+      <w:pPr>
+        <w:pStyle w:val="ListBullet"/>
+      </w:pPr>
+      <w:r>
+        <w:t>成本结构（测算值）：单次生成 API 成本约 0.8–2.5 元；服务器与运维约 3–8 万元/年。</w:t>
+      </w:r>
+    </w:p>
+    <w:p>
+      <w:pPr>
+        <w:pStyle w:val="ListBullet"/>
+      </w:pPr>
+      <w:r>
+        <w:t>盈亏平衡（测算值）：按上述成本反算，约需 1.2–2.5 万人次 C 端用量，或 8–12 所院校授权。</w:t>
+      </w:r>
+    </w:p>
+    <w:p>
+      <w:pPr>
         <w:pStyle w:val="Heading1"/>
       </w:pPr>
       <w:r>
@@ -1304,13 +1368,111 @@
         <w:pStyle w:val="Heading1"/>
       </w:pPr>
       <w:r>
+        <w:t>十、风险分析与应对</w:t>
+      </w:r>
+    </w:p>
+    <w:p>
+      <w:pPr>
+        <w:pStyle w:val="ListBullet"/>
+      </w:pPr>
+      <w:r>
+        <w:t>技术依赖风险：系统依赖第三方大模型 API。应对：兼容 DeepSeek 及 OpenAI 兼容接口，单模型不可用时自动降级；关键节点保留本地规则兜底，保证链路不中断。</w:t>
+      </w:r>
+    </w:p>
+    <w:p>
+      <w:pPr>
+        <w:pStyle w:val="ListBullet"/>
+      </w:pPr>
+      <w:r>
+        <w:t>内容幻觉风险：AI 生成内容无法保证 100% 准确。应对：导出前运行质量闸门（quality_gate.py / export_guard.py）做数字抽查、格式校验与去 AI 味检查；所有数字强制标注推算过程；人工复核是最后一道关口，作者须对提交内容负责。</w:t>
+      </w:r>
+    </w:p>
+    <w:p>
+      <w:pPr>
+        <w:pStyle w:val="ListBullet"/>
+      </w:pPr>
+      <w:r>
+        <w:t>同质化风险：同赛道项目扎堆易撞车。应对：开题即运行 similarity_checker 节点，输出撞车预警与差异化落点建议。</w:t>
+      </w:r>
+    </w:p>
+    <w:p>
+      <w:pPr>
+        <w:pStyle w:val="ListBullet"/>
+      </w:pPr>
+      <w:r>
+        <w:t>时效性风险：赛事规则按年度调整，知识库存在过期风险。应对：规则解析节点以当届官方通知为唯一输入源，知识库按赛事年度打版本号并定期复核。</w:t>
+      </w:r>
+    </w:p>
+    <w:p>
+      <w:pPr>
+        <w:pStyle w:val="ListBullet"/>
+      </w:pPr>
+      <w:r>
+        <w:t>合规与伦理风险：用户可能上传涉密项目材料，生成内容涉及版权与参赛原创性认定。应对：明确数据留存策略与用户协议，在导出物中提示原创性责任归属，不替代作者的原创性承诺。</w:t>
+      </w:r>
+    </w:p>
+    <w:p>
+      <w:pPr>
+        <w:pStyle w:val="Heading1"/>
+      </w:pPr>
+      <w:r>
+        <w:t>十一、佐证材料与原创性说明</w:t>
+      </w:r>
+    </w:p>
+    <w:p>
+      <w:pPr/>
+      <w:r>
+        <w:t>已完成成果：公网可访问系统（https://kechuang2026.cn）；完整源代码（本仓库，含 4 大生成器与 20 个智能体节点）；9 个赛事知识库 JSON 文件；训练库蒸馏样本；质量自检脚本；系统演示视频。</w:t>
+      </w:r>
+    </w:p>
+    <w:p>
+      <w:pPr/>
+      <w:r>
+        <w:t>待补材料（没有的请写「无」，严禁编造受理号或编号）：演示视频链接（待补）· 原创性承诺书（待补）· 软件著作权（待补）· 第三方检测报告（待补）· 用户反馈记录（待补）。</w:t>
+      </w:r>
+    </w:p>
+    <w:p>
+      <w:pPr/>
+      <w:r>
+        <w:t>原创性声明：本说明书所述系统为本项目团队自主开发；知识库内容为自建结构归纳，未复制任何受版权保护的获奖作品原文；引用公开资料已在第十四章列明出处。</w:t>
+      </w:r>
+    </w:p>
+    <w:p>
+      <w:pPr>
+        <w:pStyle w:val="ListBullet"/>
+      </w:pPr>
+      <w:r>
+        <w:t>与通用大模型（如豆包、Kimi 等）的本质差异：通用大模型给出的是一次性文本，不含赛事评分权重、不跑撞车检测、不做导出格式校验；本项目以 20 个专职节点分工 + 9 个赛事知识库 RAG + 质量闸门，把「写作」变成「按评审口径交付」。</w:t>
+      </w:r>
+    </w:p>
+    <w:p>
+      <w:pPr>
+        <w:pStyle w:val="ListBullet"/>
+      </w:pPr>
+      <w:r>
+        <w:t>若通用大模型后续增加科创备赛插件，本项目的壁垒在于：赛事知识库的结构化沉淀（规则/范文/答辩/评委范式）、评委反馈回流闭环、以及导出物的格式自检能力——这三项是长期积累资产，非单一提示词可复制。</w:t>
+      </w:r>
+    </w:p>
+    <w:p>
+      <w:pPr>
+        <w:pStyle w:val="ListBullet"/>
+      </w:pPr>
+      <w:r>
+        <w:t>客观承认对手优势：通用大模型在通用文案流畅度与多轮对话体验上更成熟；模板网站在素材丰富度上有积累。本项目聚焦「赛事材料」这一垂直场景，不与通用能力正面竞争。</w:t>
+      </w:r>
+    </w:p>
+    <w:p>
+      <w:pPr>
+        <w:pStyle w:val="Heading1"/>
+      </w:pPr>
+      <w:r>
         <w:rPr>
           <w:rFonts w:ascii="微软雅黑" w:hAnsi="微软雅黑" w:eastAsia="微软雅黑"/>
           <w:b/>
           <w:color w:val="0F1535"/>
           <w:sz w:val="32"/>
         </w:rPr>
-        <w:t>十、未来规划</w:t>
+        <w:t>十二、未来规划</w:t>
       </w:r>
     </w:p>
     <w:p>
@@ -1363,7 +1525,7 @@
           <w:color w:val="0F1535"/>
           <w:sz w:val="32"/>
         </w:rPr>
-        <w:t>十一、团队与分工</w:t>
+        <w:t>十三、团队与分工</w:t>
       </w:r>
     </w:p>
     <w:p>
@@ -1374,7 +1536,7 @@
           <w:color w:val="555555"/>
           <w:sz w:val="22"/>
         </w:rPr>
-        <w:t>（请填写真实团队成员、学校/院系、联系方式与分工）</w:t>
+        <w:t>（请填写真实团队成员、学校/院系、联系方式与分工。iCAN 口径：在校生不超过 5 人、指导教师不超过 2 人；下表为 5 名学生 + 1 名指导教师，可按实际人数增删。）</w:t>
       </w:r>
     </w:p>
     <w:tbl>
@@ -1396,13 +1558,7 @@
             <w:tcW w:type="dxa" w:w="1728"/>
           </w:tcPr>
           <w:p>
-            <w:r/>
             <w:r>
-              <w:rPr>
-                <w:rFonts w:ascii="微软雅黑" w:hAnsi="微软雅黑" w:eastAsia="微软雅黑"/>
-                <w:b/>
-                <w:sz w:val="21"/>
-              </w:rPr>
               <w:t>姓名</w:t>
             </w:r>
           </w:p>
@@ -1412,13 +1568,7 @@
             <w:tcW w:type="dxa" w:w="2880"/>
           </w:tcPr>
           <w:p>
-            <w:r/>
             <w:r>
-              <w:rPr>
-                <w:rFonts w:ascii="微软雅黑" w:hAnsi="微软雅黑" w:eastAsia="微软雅黑"/>
-                <w:b/>
-                <w:sz w:val="21"/>
-              </w:rPr>
               <w:t>学校/院系</w:t>
             </w:r>
           </w:p>
@@ -1428,13 +1578,7 @@
             <w:tcW w:type="dxa" w:w="3312"/>
           </w:tcPr>
           <w:p>
-            <w:r/>
             <w:r>
-              <w:rPr>
-                <w:rFonts w:ascii="微软雅黑" w:hAnsi="微软雅黑" w:eastAsia="微软雅黑"/>
-                <w:b/>
-                <w:sz w:val="21"/>
-              </w:rPr>
               <w:t>分工</w:t>
             </w:r>
           </w:p>
@@ -1444,13 +1588,7 @@
             <w:tcW w:type="dxa" w:w="1440"/>
           </w:tcPr>
           <w:p>
-            <w:r/>
             <w:r>
-              <w:rPr>
-                <w:rFonts w:ascii="微软雅黑" w:hAnsi="微软雅黑" w:eastAsia="微软雅黑"/>
-                <w:b/>
-                <w:sz w:val="21"/>
-              </w:rPr>
               <w:t>联系方式</w:t>
             </w:r>
           </w:p>
@@ -1462,13 +1600,7 @@
             <w:tcW w:type="dxa" w:w="1728"/>
           </w:tcPr>
           <w:p>
-            <w:r/>
             <w:r>
-              <w:rPr>
-                <w:rFonts w:ascii="微软雅黑" w:hAnsi="微软雅黑" w:eastAsia="微软雅黑"/>
-                <w:b w:val="0"/>
-                <w:sz w:val="20"/>
-              </w:rPr>
               <w:t>待填写</w:t>
             </w:r>
           </w:p>
@@ -1478,13 +1610,7 @@
             <w:tcW w:type="dxa" w:w="2880"/>
           </w:tcPr>
           <w:p>
-            <w:r/>
             <w:r>
-              <w:rPr>
-                <w:rFonts w:ascii="微软雅黑" w:hAnsi="微软雅黑" w:eastAsia="微软雅黑"/>
-                <w:b w:val="0"/>
-                <w:sz w:val="20"/>
-              </w:rPr>
               <w:t>待填写</w:t>
             </w:r>
           </w:p>
@@ -1494,14 +1620,8 @@
             <w:tcW w:type="dxa" w:w="3312"/>
           </w:tcPr>
           <w:p>
-            <w:r/>
             <w:r>
-              <w:rPr>
-                <w:rFonts w:ascii="微软雅黑" w:hAnsi="微软雅黑" w:eastAsia="微软雅黑"/>
-                <w:b w:val="0"/>
-                <w:sz w:val="20"/>
-              </w:rPr>
-              <w:t>待填写</w:t>
+              <w:t>项目负责人：整体统筹与技术路线</w:t>
             </w:r>
           </w:p>
         </w:tc>
@@ -1510,13 +1630,7 @@
             <w:tcW w:type="dxa" w:w="1440"/>
           </w:tcPr>
           <w:p>
-            <w:r/>
             <w:r>
-              <w:rPr>
-                <w:rFonts w:ascii="微软雅黑" w:hAnsi="微软雅黑" w:eastAsia="微软雅黑"/>
-                <w:b w:val="0"/>
-                <w:sz w:val="20"/>
-              </w:rPr>
               <w:t>待填写</w:t>
             </w:r>
           </w:p>
@@ -1528,13 +1642,7 @@
             <w:tcW w:type="dxa" w:w="1728"/>
           </w:tcPr>
           <w:p>
-            <w:r/>
             <w:r>
-              <w:rPr>
-                <w:rFonts w:ascii="微软雅黑" w:hAnsi="微软雅黑" w:eastAsia="微软雅黑"/>
-                <w:b w:val="0"/>
-                <w:sz w:val="20"/>
-              </w:rPr>
               <w:t>待填写</w:t>
             </w:r>
           </w:p>
@@ -1544,13 +1652,7 @@
             <w:tcW w:type="dxa" w:w="2880"/>
           </w:tcPr>
           <w:p>
-            <w:r/>
             <w:r>
-              <w:rPr>
-                <w:rFonts w:ascii="微软雅黑" w:hAnsi="微软雅黑" w:eastAsia="微软雅黑"/>
-                <w:b w:val="0"/>
-                <w:sz w:val="20"/>
-              </w:rPr>
               <w:t>待填写</w:t>
             </w:r>
           </w:p>
@@ -1560,14 +1662,8 @@
             <w:tcW w:type="dxa" w:w="3312"/>
           </w:tcPr>
           <w:p>
-            <w:r/>
             <w:r>
-              <w:rPr>
-                <w:rFonts w:ascii="微软雅黑" w:hAnsi="微软雅黑" w:eastAsia="微软雅黑"/>
-                <w:b w:val="0"/>
-                <w:sz w:val="20"/>
-              </w:rPr>
-              <w:t>待填写</w:t>
+              <w:t>后端开发：Flask 服务与智能体编排</w:t>
             </w:r>
           </w:p>
         </w:tc>
@@ -1576,13 +1672,7 @@
             <w:tcW w:type="dxa" w:w="1440"/>
           </w:tcPr>
           <w:p>
-            <w:r/>
             <w:r>
-              <w:rPr>
-                <w:rFonts w:ascii="微软雅黑" w:hAnsi="微软雅黑" w:eastAsia="微软雅黑"/>
-                <w:b w:val="0"/>
-                <w:sz w:val="20"/>
-              </w:rPr>
               <w:t>待填写</w:t>
             </w:r>
           </w:p>
@@ -1594,13 +1684,7 @@
             <w:tcW w:type="dxa" w:w="1728"/>
           </w:tcPr>
           <w:p>
-            <w:r/>
             <w:r>
-              <w:rPr>
-                <w:rFonts w:ascii="微软雅黑" w:hAnsi="微软雅黑" w:eastAsia="微软雅黑"/>
-                <w:b w:val="0"/>
-                <w:sz w:val="20"/>
-              </w:rPr>
               <w:t>待填写</w:t>
             </w:r>
           </w:p>
@@ -1610,13 +1694,7 @@
             <w:tcW w:type="dxa" w:w="2880"/>
           </w:tcPr>
           <w:p>
-            <w:r/>
             <w:r>
-              <w:rPr>
-                <w:rFonts w:ascii="微软雅黑" w:hAnsi="微软雅黑" w:eastAsia="微软雅黑"/>
-                <w:b w:val="0"/>
-                <w:sz w:val="20"/>
-              </w:rPr>
               <w:t>待填写</w:t>
             </w:r>
           </w:p>
@@ -1626,14 +1704,8 @@
             <w:tcW w:type="dxa" w:w="3312"/>
           </w:tcPr>
           <w:p>
-            <w:r/>
             <w:r>
-              <w:rPr>
-                <w:rFonts w:ascii="微软雅黑" w:hAnsi="微软雅黑" w:eastAsia="微软雅黑"/>
-                <w:b w:val="0"/>
-                <w:sz w:val="20"/>
-              </w:rPr>
-              <w:t>待填写</w:t>
+              <w:t>前端开发：单页应用与流式交互</w:t>
             </w:r>
           </w:p>
         </w:tc>
@@ -1642,13 +1714,133 @@
             <w:tcW w:type="dxa" w:w="1440"/>
           </w:tcPr>
           <w:p>
-            <w:r/>
             <w:r>
-              <w:rPr>
-                <w:rFonts w:ascii="微软雅黑" w:hAnsi="微软雅黑" w:eastAsia="微软雅黑"/>
-                <w:b w:val="0"/>
-                <w:sz w:val="20"/>
-              </w:rPr>
+              <w:t>待填写</w:t>
+            </w:r>
+          </w:p>
+        </w:tc>
+      </w:tr>
+      <w:tr>
+        <w:tc>
+          <w:tcPr>
+            <w:tcW w:type="dxa" w:w="2160"/>
+          </w:tcPr>
+          <w:p>
+            <w:r>
+              <w:t>待填写</w:t>
+            </w:r>
+          </w:p>
+        </w:tc>
+        <w:tc>
+          <w:tcPr>
+            <w:tcW w:type="dxa" w:w="2160"/>
+          </w:tcPr>
+          <w:p>
+            <w:r>
+              <w:t>待填写</w:t>
+            </w:r>
+          </w:p>
+        </w:tc>
+        <w:tc>
+          <w:tcPr>
+            <w:tcW w:type="dxa" w:w="2160"/>
+          </w:tcPr>
+          <w:p>
+            <w:r>
+              <w:t>知识库与数据：赛事规则与蒸馏样本</w:t>
+            </w:r>
+          </w:p>
+        </w:tc>
+        <w:tc>
+          <w:tcPr>
+            <w:tcW w:type="dxa" w:w="2160"/>
+          </w:tcPr>
+          <w:p>
+            <w:r>
+              <w:t>待填写</w:t>
+            </w:r>
+          </w:p>
+        </w:tc>
+      </w:tr>
+      <w:tr>
+        <w:tc>
+          <w:tcPr>
+            <w:tcW w:type="dxa" w:w="2160"/>
+          </w:tcPr>
+          <w:p>
+            <w:r>
+              <w:t>待填写</w:t>
+            </w:r>
+          </w:p>
+        </w:tc>
+        <w:tc>
+          <w:tcPr>
+            <w:tcW w:type="dxa" w:w="2160"/>
+          </w:tcPr>
+          <w:p>
+            <w:r>
+              <w:t>待填写</w:t>
+            </w:r>
+          </w:p>
+        </w:tc>
+        <w:tc>
+          <w:tcPr>
+            <w:tcW w:type="dxa" w:w="2160"/>
+          </w:tcPr>
+          <w:p>
+            <w:r>
+              <w:t>测试与交付：导出质量闸门与文档</w:t>
+            </w:r>
+          </w:p>
+        </w:tc>
+        <w:tc>
+          <w:tcPr>
+            <w:tcW w:type="dxa" w:w="2160"/>
+          </w:tcPr>
+          <w:p>
+            <w:r>
+              <w:t>待填写</w:t>
+            </w:r>
+          </w:p>
+        </w:tc>
+      </w:tr>
+      <w:tr>
+        <w:tc>
+          <w:tcPr>
+            <w:tcW w:type="dxa" w:w="2160"/>
+          </w:tcPr>
+          <w:p>
+            <w:r>
+              <w:t>待填写（指导教师）</w:t>
+            </w:r>
+          </w:p>
+        </w:tc>
+        <w:tc>
+          <w:tcPr>
+            <w:tcW w:type="dxa" w:w="2160"/>
+          </w:tcPr>
+          <w:p>
+            <w:r>
+              <w:t>待填写</w:t>
+            </w:r>
+          </w:p>
+        </w:tc>
+        <w:tc>
+          <w:tcPr>
+            <w:tcW w:type="dxa" w:w="2160"/>
+          </w:tcPr>
+          <w:p>
+            <w:r>
+              <w:t>指导教师：方向把关与进度管理</w:t>
+            </w:r>
+          </w:p>
+        </w:tc>
+        <w:tc>
+          <w:tcPr>
+            <w:tcW w:type="dxa" w:w="2160"/>
+          </w:tcPr>
+          <w:p>
+            <w:r>
               <w:t>待填写</w:t>
             </w:r>
           </w:p>
@@ -1667,7 +1859,7 @@
           <w:color w:val="0F1535"/>
           <w:sz w:val="32"/>
         </w:rPr>
-        <w:t>十二、参考文献与可溯源资料</w:t>
+        <w:t>十四、参考文献与可溯源资料</w:t>
       </w:r>
     </w:p>
     <w:p>

</xml_diff>